<commit_message>
Filled out the phone and emails in the signature block.
</commit_message>
<xml_diff>
--- a/Filings/Discovery/FirstSetDiscovey/Plaintiffs_First_Set_of_Interrogatories_to_FIE.docx
+++ b/Filings/Discovery/FirstSetDiscovey/Plaintiffs_First_Set_of_Interrogatories_to_FIE.docx
@@ -950,6 +950,38 @@
     </w:p>
     <w:p>
       <w:pPr>
+        <w:spacing w:after="0" w:before="120"/>
+      </w:pPr>
+      <w:r>
+        <w:t>17756 George Moran Dr.</w:t>
+      </w:r>
+    </w:p>
+    <w:p>
+      <w:pPr>
+        <w:spacing w:after="0" w:before="120"/>
+      </w:pPr>
+      <w:r>
+        <w:t>Eden Prairie, MN 55347</w:t>
+      </w:r>
+    </w:p>
+    <w:p>
+      <w:pPr>
+        <w:spacing w:after="0" w:before="120"/>
+      </w:pPr>
+      <w:r>
+        <w:t>Telephone: 763-843-2859</w:t>
+      </w:r>
+    </w:p>
+    <w:p>
+      <w:pPr>
+        <w:spacing w:after="0" w:before="120"/>
+      </w:pPr>
+      <w:r>
+        <w:t>Email: bill_y_lu@yahoo.com</w:t>
+      </w:r>
+    </w:p>
+    <w:p>
+      <w:pPr>
         <w:spacing w:after="0" w:before="240"/>
       </w:pPr>
       <w:r>
@@ -992,7 +1024,15 @@
         <w:spacing w:after="0"/>
       </w:pPr>
       <w:r>
-        <w:t xml:space="preserve">Telephone: ______________   Email: ______________</w:t>
+        <w:t>Telephone: 763-843-2860</w:t>
+      </w:r>
+    </w:p>
+    <w:p>
+      <w:pPr>
+        <w:spacing w:after="0" w:before="120"/>
+      </w:pPr>
+      <w:r>
+        <w:t>Email: jie_h_hu@yahoo.com</w:t>
       </w:r>
     </w:p>
     <w:p>
@@ -1023,7 +1063,7 @@
         <w:t xml:space="preserve">Plaintiffs’ First Set of Interrogatories to Defendant Fire Insurance Exchange</w:t>
       </w:r>
       <w:r>
-        <w:t xml:space="preserve"> was served upon Defendant, through its attorney of record (or upon Defendant directly if no attorney has appeared), by ______________ [e-service through the Minnesota eFS system / email / U.S. Mail], at ______________, in accordance with Minn. R. Civ. P. 5. These discovery requests are served, not filed, in accordance with Minn. R. Civ. P. 5.04.</w:t>
+        <w:t xml:space="preserve"> was served upon Defendant, through its attorney of record (or upon Defendant directly if no attorney has appeared), by ______________ [e-service through the Minnesota eFS system / email / U.S. Mail], at ______________, in accordance with Minn. R. Civ. P. 5. These discovery requests are served, not filed, in accordance with Minn. R. Civ. P. 5.04(b).</w:t>
       </w:r>
     </w:p>
     <w:p>

</xml_diff>